<commit_message>
Update to 2025-2026 läsår
</commit_message>
<xml_diff>
--- a/src/assets/documents/Riktlinje för Små Hopp.docx
+++ b/src/assets/documents/Riktlinje för Små Hopp.docx
@@ -1740,7 +1740,42 @@
         <w:sz w:val="16"/>
         <w:szCs w:val="16"/>
       </w:rPr>
-      <w:t>Datum 2024-11-20</w:t>
+      <w:t>Datum 202</w:t>
+    </w:r>
+    <w:r>
+      <w:rPr>
+        <w:sz w:val="16"/>
+        <w:szCs w:val="16"/>
+      </w:rPr>
+      <w:t>6</w:t>
+    </w:r>
+    <w:r>
+      <w:rPr>
+        <w:sz w:val="16"/>
+        <w:szCs w:val="16"/>
+      </w:rPr>
+      <w:t>-</w:t>
+    </w:r>
+    <w:r>
+      <w:rPr>
+        <w:sz w:val="16"/>
+        <w:szCs w:val="16"/>
+      </w:rPr>
+      <w:t>01</w:t>
+    </w:r>
+    <w:r>
+      <w:rPr>
+        <w:sz w:val="16"/>
+        <w:szCs w:val="16"/>
+      </w:rPr>
+      <w:t>-</w:t>
+    </w:r>
+    <w:r>
+      <w:rPr>
+        <w:sz w:val="16"/>
+        <w:szCs w:val="16"/>
+      </w:rPr>
+      <w:t>01</w:t>
     </w:r>
   </w:p>
 </w:hdr>

</xml_diff>